<commit_message>
Manuale: aggiorna docx omaggio singola riga
Co-Authored-By: Claude Sonnet 4.6 <noreply@anthropic.com>
</commit_message>
<xml_diff>
--- a/guide/Manuale_Cassa_Dalila.docx
+++ b/guide/Manuale_Cassa_Dalila.docx
@@ -2114,6 +2114,19 @@
         <w:spacing w:before="40" w:after="40"/>
       </w:pPr>
       <w:r>
+        <w:t>Per omaggiare una singola riga, clicca l'icona omaggio direttamente sulla riga del prodotto</w:t>
+      </w:r>
+    </w:p>
+    <w:p>
+      <w:pPr>
+        <w:pStyle w:val="Paragrafoelenco"/>
+        <w:numPr>
+          <w:ilvl w:val="0"/>
+          <w:numId w:val="3"/>
+        </w:numPr>
+        <w:spacing w:before="40" w:after="40"/>
+      </w:pPr>
+      <w:r>
         <w:t xml:space="preserve">Per assegnare un numero tavolo, clicca il pulsante </w:t>
       </w:r>
       <w:r>
@@ -2581,19 +2594,6 @@
           <w:b/>
         </w:rPr>
         <w:t>Ristampa</w:t>
-      </w:r>
-    </w:p>
-    <w:p>
-      <w:pPr>
-        <w:pStyle w:val="Paragrafoelenco"/>
-        <w:numPr>
-          <w:ilvl w:val="0"/>
-          <w:numId w:val="2"/>
-        </w:numPr>
-        <w:spacing w:before="40" w:after="40"/>
-      </w:pPr>
-      <w:r>
-        <w:t>Impostare o rimuovere l'omaggio su singole righe</w:t>
       </w:r>
     </w:p>
     <w:p>

</xml_diff>

<commit_message>
Manuale: corregge sezione comande
Flusso evasione: checkbox sui singoli prodotti → Segna come evasa.
Rimossa sottosezione Vista per-riga, semplificata sezione Riepilogo.

Co-Authored-By: Claude Sonnet 4.6 <noreply@anthropic.com>
</commit_message>
<xml_diff>
--- a/guide/Manuale_Cassa_Dalila.docx
+++ b/guide/Manuale_Cassa_Dalila.docx
@@ -2979,28 +2979,47 @@
     </w:p>
     <w:p>
       <w:pPr>
-        <w:spacing w:after="120"/>
-      </w:pPr>
-      <w:r>
-        <w:t xml:space="preserve">Quando un ordine è pronto, premi il pulsante verde </w:t>
-      </w:r>
-      <w:r>
-        <w:rPr>
-          <w:b/>
-        </w:rPr>
-        <w:t>EVASA</w:t>
-      </w:r>
-      <w:r>
-        <w:t xml:space="preserve"> sulla card. La comanda passa nella sezione in basso. Premi </w:t>
-      </w:r>
-      <w:r>
-        <w:rPr>
-          <w:b/>
-        </w:rPr>
-        <w:t>Riapri</w:t>
-      </w:r>
-      <w:r>
-        <w:t xml:space="preserve"> se hai premuto per errore.</w:t>
+        <w:pStyle w:val="Paragrafoelenco"/>
+        <w:numPr>
+          <w:ilvl w:val="0"/>
+          <w:numId w:val="3"/>
+        </w:numPr>
+        <w:spacing w:before="40" w:after="40"/>
+      </w:pPr>
+      <w:r>
+        <w:t>Man mano che i prodotti sono pronti, spunta le singole righe sulla card — le checkbox sono sincronizzate in tempo reale tra tutti i dispositivi</w:t>
+      </w:r>
+    </w:p>
+    <w:p>
+      <w:pPr>
+        <w:pStyle w:val="Paragrafoelenco"/>
+        <w:numPr>
+          <w:ilvl w:val="0"/>
+          <w:numId w:val="3"/>
+        </w:numPr>
+        <w:spacing w:before="40" w:after="40"/>
+      </w:pPr>
+      <w:r>
+        <w:t xml:space="preserve">Quando tutto è pronto, premi </w:t>
+      </w:r>
+      <w:r>
+        <w:rPr>
+          <w:b/>
+        </w:rPr>
+        <w:t>Segna come evasa</w:t>
+      </w:r>
+    </w:p>
+    <w:p>
+      <w:pPr>
+        <w:pStyle w:val="Paragrafoelenco"/>
+        <w:numPr>
+          <w:ilvl w:val="0"/>
+          <w:numId w:val="3"/>
+        </w:numPr>
+        <w:spacing w:before="40" w:after="40"/>
+      </w:pPr>
+      <w:r>
+        <w:t>La comanda scompare dalla lista attiva e viene archiviata</w:t>
       </w:r>
     </w:p>
     <w:p>
@@ -3011,7 +3030,7 @@
         </w:pBdr>
       </w:pPr>
       <w:r>
-        <w:t>Checkbox per singola riga</w:t>
+        <w:t>Riepilogo</w:t>
       </w:r>
     </w:p>
     <w:p>
@@ -3019,56 +3038,16 @@
         <w:spacing w:after="120"/>
       </w:pPr>
       <w:r>
-        <w:t>Ogni riga di una comanda ha una checkbox per segnare i singoli prodotti come pronti. Le checkbox sono sincronizzate in tempo reale tra tutti i dispositivi.</w:t>
-      </w:r>
-    </w:p>
-    <w:p>
-      <w:pPr>
-        <w:pStyle w:val="Heading20"/>
-        <w:pBdr>
-          <w:bottom w:val="single" w:sz="4" w:space="4" w:color="D97706"/>
-        </w:pBdr>
-      </w:pPr>
-      <w:r>
-        <w:t>Vista per-riga e Riepilogo</w:t>
-      </w:r>
-    </w:p>
-    <w:p>
-      <w:pPr>
-        <w:pStyle w:val="Paragrafoelenco"/>
-        <w:numPr>
-          <w:ilvl w:val="0"/>
-          <w:numId w:val="2"/>
-        </w:numPr>
-        <w:spacing w:before="40" w:after="40"/>
-      </w:pPr>
-      <w:r>
-        <w:rPr>
-          <w:b/>
-        </w:rPr>
-        <w:t>Vista per-riga:</w:t>
-      </w:r>
-      <w:r>
-        <w:t xml:space="preserve"> mostra tutti i prodotti raggruppati per tipo invece che per scontrino.</w:t>
-      </w:r>
-    </w:p>
-    <w:p>
-      <w:pPr>
-        <w:pStyle w:val="Paragrafoelenco"/>
-        <w:numPr>
-          <w:ilvl w:val="0"/>
-          <w:numId w:val="2"/>
-        </w:numPr>
-        <w:spacing w:before="40" w:after="40"/>
-      </w:pPr>
-      <w:r>
-        <w:rPr>
-          <w:b/>
-        </w:rPr>
-        <w:t>Riepilogo:</w:t>
-      </w:r>
-      <w:r>
-        <w:t xml:space="preserve"> pannello con i totali aggregati di tutti i prodotti ancora da preparare.</w:t>
+        <w:t xml:space="preserve">Il pulsante </w:t>
+      </w:r>
+      <w:r>
+        <w:rPr>
+          <w:b/>
+        </w:rPr>
+        <w:t>Riepilogo</w:t>
+      </w:r>
+      <w:r>
+        <w:t xml:space="preserve"> mostra i totali aggregati di tutti i prodotti ancora da preparare — utile per avere un colpo d'occhio sulle quantità in coda.</w:t>
       </w:r>
     </w:p>
     <w:p>

</xml_diff>

<commit_message>
Fix: descrizione filtri comande in sezione 6 del manuale
Co-Authored-By: Claude Sonnet 4.6 <noreply@anthropic.com>
</commit_message>
<xml_diff>
--- a/guide/Manuale_Cassa_Dalila.docx
+++ b/guide/Manuale_Cassa_Dalila.docx
@@ -2832,7 +2832,7 @@
           <w:p>
             <w:r/>
             <w:r>
-              <w:t>Tutte / [famiglia]...</w:t>
+              <w:t>Tutte · Cucina · Bar...</w:t>
             </w:r>
           </w:p>
         </w:tc>
@@ -2850,7 +2850,7 @@
           <w:p>
             <w:r/>
             <w:r>
-              <w:t>Filtra per famiglia di prodotti</w:t>
+              <w:t>Pulsanti famiglia: mostrano solo le comande con prodotti di quella famiglia</w:t>
             </w:r>
           </w:p>
         </w:tc>

</xml_diff>